<commit_message>
Hold formler inde i de nummererede lister i dagens vejledninger
En formel direkte efter et listepunkt brød listen, så det næste punkt
startede en ny liste. Formlerne er indrykket, og alle tre formater er
renderet igen.

Co-Authored-By: Claude Opus 5.5 <noreply@anthropic.com>
</commit_message>
<xml_diff>
--- a/Øvelser/Geografi/bjergarternes-kredsloeb/bjergarternes-kredsloeb.docx
+++ b/Øvelser/Geografi/bjergarternes-kredsloeb/bjergarternes-kredsloeb.docx
@@ -2027,7 +2027,6 @@
     </w:p>
     <w:p>
       <w:pPr>
-        <w:pStyle w:val="Compact"/>
         <w:numPr>
           <w:ilvl w:val="0"/>
           <w:numId w:val="1007"/>
@@ -2053,7 +2052,7 @@
     </w:p>
     <w:p>
       <w:pPr>
-        <w:pStyle w:val="FirstParagraph"/>
+        <w:pStyle w:val="BodyText"/>
       </w:pPr>
       <m:oMathPara>
         <m:oMathParaPr>
@@ -2153,6 +2152,62 @@
     </w:p>
     <w:p>
       <w:pPr>
+        <w:numPr>
+          <w:ilvl w:val="0"/>
+          <w:numId w:val="1007"/>
+        </w:numPr>
+      </w:pPr>
+      <w:r>
+        <w:t xml:space="preserve">Angiv den mindste og den største kornstørrelse. Er kornene nogenlunde lige store, eller er der store krystaller i en finkornet grundmasse (en</w:t>
+      </w:r>
+      <w:r>
+        <w:t xml:space="preserve"> </w:t>
+      </w:r>
+      <w:r>
+        <w:rPr>
+          <w:i/>
+          <w:iCs/>
+        </w:rPr>
+        <w:t xml:space="preserve">porfyr</w:t>
+      </w:r>
+      <w:r>
+        <w:t xml:space="preserve">)?</w:t>
+      </w:r>
+    </w:p>
+    <w:p>
+      <w:pPr>
+        <w:numPr>
+          <w:ilvl w:val="0"/>
+          <w:numId w:val="1007"/>
+        </w:numPr>
+      </w:pPr>
+      <w:r>
+        <w:t xml:space="preserve">Er stenen fin-, middel- eller grovkornet ud fra gennemsnittet? Hvad fortæller det om, hvor hurtigt den er størknet eller dannet?</w:t>
+      </w:r>
+    </w:p>
+    <w:p>
+      <w:pPr>
+        <w:numPr>
+          <w:ilvl w:val="0"/>
+          <w:numId w:val="1007"/>
+        </w:numPr>
+      </w:pPr>
+      <w:r>
+        <w:t xml:space="preserve">Sammenlign kornstørrelsen med en anden gruppes sten. Lav evt. et fælles diagram over klassens sten med gennemsnitlig kornstørrelse og hovedgruppe.</w:t>
+      </w:r>
+    </w:p>
+    <w:bookmarkEnd w:id="36"/>
+    <w:bookmarkStart w:id="37" w:name="journalspørgsmål"/>
+    <w:p>
+      <w:pPr>
+        <w:pStyle w:val="Heading2"/>
+      </w:pPr>
+      <w:r>
+        <w:t xml:space="preserve">Journalspørgsmål</w:t>
+      </w:r>
+    </w:p>
+    <w:p>
+      <w:pPr>
         <w:pStyle w:val="Compact"/>
         <w:numPr>
           <w:ilvl w:val="0"/>
@@ -2160,20 +2215,7 @@
         </w:numPr>
       </w:pPr>
       <w:r>
-        <w:t xml:space="preserve">Angiv den mindste og den største kornstørrelse. Er kornene nogenlunde lige store, eller er der store krystaller i en finkornet grundmasse (en</w:t>
-      </w:r>
-      <w:r>
-        <w:t xml:space="preserve"> </w:t>
-      </w:r>
-      <w:r>
-        <w:rPr>
-          <w:i/>
-          <w:iCs/>
-        </w:rPr>
-        <w:t xml:space="preserve">porfyr</w:t>
-      </w:r>
-      <w:r>
-        <w:t xml:space="preserve">)?</w:t>
+        <w:t xml:space="preserve">Argumentér for jeres placering af prøverne i Del II. Hvilke var lettest og sværest at placere, og hvorfor?</w:t>
       </w:r>
     </w:p>
     <w:p>
@@ -2185,7 +2227,7 @@
         </w:numPr>
       </w:pPr>
       <w:r>
-        <w:t xml:space="preserve">Er stenen fin-, middel- eller grovkornet ud fra gennemsnittet? Hvad fortæller det om, hvor hurtigt den er størknet eller dannet?</w:t>
+        <w:t xml:space="preserve">Hvilke mineraler tror I, jeres store sten består af? Brug farve, hårdhed og magnetisme som argumenter.</w:t>
       </w:r>
     </w:p>
     <w:p>
@@ -2197,17 +2239,73 @@
         </w:numPr>
       </w:pPr>
       <w:r>
-        <w:t xml:space="preserve">Sammenlign kornstørrelsen med en anden gruppes sten. Lav evt. et fælles diagram over klassens sten med gennemsnitlig kornstørrelse og hovedgruppe.</w:t>
-      </w:r>
-    </w:p>
-    <w:bookmarkEnd w:id="36"/>
-    <w:bookmarkStart w:id="37" w:name="journalspørgsmål"/>
+        <w:t xml:space="preserve">Hvilken hovedgruppe hører stenen til, og hvor i kredsløbet ville I placere den? Kan I give den et navn?</w:t>
+      </w:r>
+    </w:p>
+    <w:p>
+      <w:pPr>
+        <w:pStyle w:val="Compact"/>
+        <w:numPr>
+          <w:ilvl w:val="0"/>
+          <w:numId w:val="1008"/>
+        </w:numPr>
+      </w:pPr>
+      <w:r>
+        <w:t xml:space="preserve">Forklar sammenhængen mellem kornstørrelse og afkølingshastighed i magmatiske bjergarter.</w:t>
+      </w:r>
+    </w:p>
+    <w:p>
+      <w:pPr>
+        <w:pStyle w:val="Compact"/>
+        <w:numPr>
+          <w:ilvl w:val="0"/>
+          <w:numId w:val="1008"/>
+        </w:numPr>
+      </w:pPr>
+      <w:r>
+        <w:t xml:space="preserve">Hvordan kan en granit blive til en sandsten, og en sandsten blive til en kvartsit? Følg vejen rundt i kredsløbet.</w:t>
+      </w:r>
+    </w:p>
+    <w:p>
+      <w:pPr>
+        <w:pStyle w:val="Compact"/>
+        <w:numPr>
+          <w:ilvl w:val="0"/>
+          <w:numId w:val="1008"/>
+        </w:numPr>
+      </w:pPr>
+      <w:r>
+        <w:t xml:space="preserve">Hvorfor er de fleste store sten i Danmark magmatiske eller metamorfe, når Danmarks egen undergrund næsten kun består af sedimentære bjergarter som kalk, kridt, ler og sand?</w:t>
+      </w:r>
+    </w:p>
+    <w:p>
+      <w:pPr>
+        <w:pStyle w:val="Compact"/>
+        <w:numPr>
+          <w:ilvl w:val="0"/>
+          <w:numId w:val="1008"/>
+        </w:numPr>
+      </w:pPr>
+      <w:r>
+        <w:t xml:space="preserve">Vurdér metoden: hvor sikker er en bestemmelse ud fra et billede og en kniv? Hvilke kendetegn var mest pålidelige?</w:t>
+      </w:r>
+    </w:p>
+    <w:bookmarkEnd w:id="37"/>
+    <w:bookmarkStart w:id="38" w:name="om-denne-udgave"/>
     <w:p>
       <w:pPr>
         <w:pStyle w:val="Heading2"/>
       </w:pPr>
       <w:r>
-        <w:t xml:space="preserve">Journalspørgsmål</w:t>
+        <w:t xml:space="preserve">Om denne udgave</w:t>
+      </w:r>
+    </w:p>
+    <w:p>
+      <w:pPr>
+        <w:pStyle w:val="FirstParagraph"/>
+      </w:pPr>
+      <w:r>
+        <w:t xml:space="preserve">Bygger på opbygningen af en ældre NV-øvelse om bjergarternes kredsløb (2019/20) med tre dele: teori om de tre hovedgrupper, sortering af prøver på en bestemmelsesdug og undersøgelse af en stor sten udenfor. Teksten er skrevet helt ny. Ændret i forhold til den ældre øvelse:</w:t>
       </w:r>
     </w:p>
     <w:p>
@@ -2219,7 +2317,7 @@
         </w:numPr>
       </w:pPr>
       <w:r>
-        <w:t xml:space="preserve">Argumentér for jeres placering af prøverne i Del II. Hvilke var lettest og sværest at placere, og hvorfor?</w:t>
+        <w:t xml:space="preserve">Del III var bundet til bestemte sten på én skole. Nu kan øvelsen bruges overalt: eleverne finder selv en stor sten på skolen, i en park eller på stranden.</w:t>
       </w:r>
     </w:p>
     <w:p>
@@ -2231,7 +2329,7 @@
         </w:numPr>
       </w:pPr>
       <w:r>
-        <w:t xml:space="preserve">Hvilke mineraler tror I, jeres store sten består af? Brug farve, hårdhed og magnetisme som argumenter.</w:t>
+        <w:t xml:space="preserve">Den ældre øvelse forudsatte en bestemt kommerciel bestemmelsesdug. Nu kan man bruge en dug, hvis skolen har en, eller tegne kredsløbet selv, og sitets stensamling med bestemmelsesnøgle kan bruges til at give prøverne navn.</w:t>
       </w:r>
     </w:p>
     <w:p>
@@ -2240,108 +2338,6 @@
         <w:numPr>
           <w:ilvl w:val="0"/>
           <w:numId w:val="1009"/>
-        </w:numPr>
-      </w:pPr>
-      <w:r>
-        <w:t xml:space="preserve">Hvilken hovedgruppe hører stenen til, og hvor i kredsløbet ville I placere den? Kan I give den et navn?</w:t>
-      </w:r>
-    </w:p>
-    <w:p>
-      <w:pPr>
-        <w:pStyle w:val="Compact"/>
-        <w:numPr>
-          <w:ilvl w:val="0"/>
-          <w:numId w:val="1009"/>
-        </w:numPr>
-      </w:pPr>
-      <w:r>
-        <w:t xml:space="preserve">Forklar sammenhængen mellem kornstørrelse og afkølingshastighed i magmatiske bjergarter.</w:t>
-      </w:r>
-    </w:p>
-    <w:p>
-      <w:pPr>
-        <w:pStyle w:val="Compact"/>
-        <w:numPr>
-          <w:ilvl w:val="0"/>
-          <w:numId w:val="1009"/>
-        </w:numPr>
-      </w:pPr>
-      <w:r>
-        <w:t xml:space="preserve">Hvordan kan en granit blive til en sandsten, og en sandsten blive til en kvartsit? Følg vejen rundt i kredsløbet.</w:t>
-      </w:r>
-    </w:p>
-    <w:p>
-      <w:pPr>
-        <w:pStyle w:val="Compact"/>
-        <w:numPr>
-          <w:ilvl w:val="0"/>
-          <w:numId w:val="1009"/>
-        </w:numPr>
-      </w:pPr>
-      <w:r>
-        <w:t xml:space="preserve">Hvorfor er de fleste store sten i Danmark magmatiske eller metamorfe, når Danmarks egen undergrund næsten kun består af sedimentære bjergarter som kalk, kridt, ler og sand?</w:t>
-      </w:r>
-    </w:p>
-    <w:p>
-      <w:pPr>
-        <w:pStyle w:val="Compact"/>
-        <w:numPr>
-          <w:ilvl w:val="0"/>
-          <w:numId w:val="1009"/>
-        </w:numPr>
-      </w:pPr>
-      <w:r>
-        <w:t xml:space="preserve">Vurdér metoden: hvor sikker er en bestemmelse ud fra et billede og en kniv? Hvilke kendetegn var mest pålidelige?</w:t>
-      </w:r>
-    </w:p>
-    <w:bookmarkEnd w:id="37"/>
-    <w:bookmarkStart w:id="38" w:name="om-denne-udgave"/>
-    <w:p>
-      <w:pPr>
-        <w:pStyle w:val="Heading2"/>
-      </w:pPr>
-      <w:r>
-        <w:t xml:space="preserve">Om denne udgave</w:t>
-      </w:r>
-    </w:p>
-    <w:p>
-      <w:pPr>
-        <w:pStyle w:val="FirstParagraph"/>
-      </w:pPr>
-      <w:r>
-        <w:t xml:space="preserve">Bygger på opbygningen af en ældre NV-øvelse om bjergarternes kredsløb (2019/20) med tre dele: teori om de tre hovedgrupper, sortering af prøver på en bestemmelsesdug og undersøgelse af en stor sten udenfor. Teksten er skrevet helt ny. Ændret i forhold til den ældre øvelse:</w:t>
-      </w:r>
-    </w:p>
-    <w:p>
-      <w:pPr>
-        <w:pStyle w:val="Compact"/>
-        <w:numPr>
-          <w:ilvl w:val="0"/>
-          <w:numId w:val="1010"/>
-        </w:numPr>
-      </w:pPr>
-      <w:r>
-        <w:t xml:space="preserve">Del III var bundet til bestemte sten på én skole. Nu kan øvelsen bruges overalt: eleverne finder selv en stor sten på skolen, i en park eller på stranden.</w:t>
-      </w:r>
-    </w:p>
-    <w:p>
-      <w:pPr>
-        <w:pStyle w:val="Compact"/>
-        <w:numPr>
-          <w:ilvl w:val="0"/>
-          <w:numId w:val="1010"/>
-        </w:numPr>
-      </w:pPr>
-      <w:r>
-        <w:t xml:space="preserve">Den ældre øvelse forudsatte en bestemt kommerciel bestemmelsesdug. Nu kan man bruge en dug, hvis skolen har en, eller tegne kredsløbet selv, og sitets stensamling med bestemmelsesnøgle kan bruges til at give prøverne navn.</w:t>
-      </w:r>
-    </w:p>
-    <w:p>
-      <w:pPr>
-        <w:pStyle w:val="Compact"/>
-        <w:numPr>
-          <w:ilvl w:val="0"/>
-          <w:numId w:val="1010"/>
         </w:numPr>
       </w:pPr>
       <w:r>
@@ -2876,91 +2872,6 @@
       </w:rPr>
     </w:lvl>
   </w:abstractNum>
-  <w:abstractNum w:abstractNumId="99412">
-    <w:nsid w:val="00A99412"/>
-    <w:multiLevelType w:val="multilevel"/>
-    <w:lvl w:ilvl="0">
-      <w:start w:val="2"/>
-      <w:numFmt w:val="decimal"/>
-      <w:lvlText w:val="%1."/>
-      <w:lvlJc w:val="left"/>
-      <w:pPr>
-        <w:ind w:left="720" w:hanging="360"/>
-      </w:pPr>
-    </w:lvl>
-    <w:lvl w:ilvl="1">
-      <w:start w:val="2"/>
-      <w:numFmt w:val="decimal"/>
-      <w:lvlText w:val="%2."/>
-      <w:lvlJc w:val="left"/>
-      <w:pPr>
-        <w:ind w:left="1440" w:hanging="360"/>
-      </w:pPr>
-    </w:lvl>
-    <w:lvl w:ilvl="2">
-      <w:start w:val="2"/>
-      <w:numFmt w:val="decimal"/>
-      <w:lvlText w:val="%3."/>
-      <w:lvlJc w:val="left"/>
-      <w:pPr>
-        <w:ind w:left="2160" w:hanging="360"/>
-      </w:pPr>
-    </w:lvl>
-    <w:lvl w:ilvl="3">
-      <w:start w:val="2"/>
-      <w:numFmt w:val="decimal"/>
-      <w:lvlText w:val="%4."/>
-      <w:lvlJc w:val="left"/>
-      <w:pPr>
-        <w:ind w:left="2880" w:hanging="360"/>
-      </w:pPr>
-    </w:lvl>
-    <w:lvl w:ilvl="4">
-      <w:start w:val="2"/>
-      <w:numFmt w:val="decimal"/>
-      <w:lvlText w:val="%5."/>
-      <w:lvlJc w:val="left"/>
-      <w:pPr>
-        <w:ind w:left="3600" w:hanging="360"/>
-      </w:pPr>
-    </w:lvl>
-    <w:lvl w:ilvl="5">
-      <w:start w:val="2"/>
-      <w:numFmt w:val="decimal"/>
-      <w:lvlText w:val="%6."/>
-      <w:lvlJc w:val="left"/>
-      <w:pPr>
-        <w:ind w:left="4320" w:hanging="360"/>
-      </w:pPr>
-    </w:lvl>
-    <w:lvl w:ilvl="6">
-      <w:start w:val="2"/>
-      <w:numFmt w:val="decimal"/>
-      <w:lvlText w:val="%7."/>
-      <w:lvlJc w:val="left"/>
-      <w:pPr>
-        <w:ind w:left="5040" w:hanging="360"/>
-      </w:pPr>
-    </w:lvl>
-    <w:lvl w:ilvl="7">
-      <w:start w:val="2"/>
-      <w:numFmt w:val="decimal"/>
-      <w:lvlText w:val="%8."/>
-      <w:lvlJc w:val="left"/>
-      <w:pPr>
-        <w:ind w:left="5760" w:hanging="360"/>
-      </w:pPr>
-    </w:lvl>
-    <w:lvl w:ilvl="8">
-      <w:start w:val="2"/>
-      <w:numFmt w:val="decimal"/>
-      <w:lvlText w:val="%9."/>
-      <w:lvlJc w:val="left"/>
-      <w:pPr>
-        <w:ind w:left="6480" w:hanging="360"/>
-      </w:pPr>
-    </w:lvl>
-  </w:abstractNum>
   <w:num w:numId="1">
     <w:abstractNumId w:val="1"/>
     <w:lvlOverride w:ilvl="0">
@@ -3112,66 +3023,36 @@
     </w:lvlOverride>
   </w:num>
   <w:num w:numId="1008">
-    <w:abstractNumId w:val="99412"/>
+    <w:abstractNumId w:val="99411"/>
     <w:lvlOverride w:ilvl="0">
-      <w:startOverride w:val="2"/>
+      <w:startOverride w:val="1"/>
     </w:lvlOverride>
     <w:lvlOverride w:ilvl="1">
-      <w:startOverride w:val="2"/>
+      <w:startOverride w:val="1"/>
     </w:lvlOverride>
     <w:lvlOverride w:ilvl="2">
-      <w:startOverride w:val="2"/>
+      <w:startOverride w:val="1"/>
     </w:lvlOverride>
     <w:lvlOverride w:ilvl="3">
-      <w:startOverride w:val="2"/>
+      <w:startOverride w:val="1"/>
     </w:lvlOverride>
     <w:lvlOverride w:ilvl="4">
-      <w:startOverride w:val="2"/>
+      <w:startOverride w:val="1"/>
     </w:lvlOverride>
     <w:lvlOverride w:ilvl="5">
-      <w:startOverride w:val="2"/>
+      <w:startOverride w:val="1"/>
     </w:lvlOverride>
     <w:lvlOverride w:ilvl="6">
-      <w:startOverride w:val="2"/>
+      <w:startOverride w:val="1"/>
     </w:lvlOverride>
     <w:lvlOverride w:ilvl="7">
-      <w:startOverride w:val="2"/>
+      <w:startOverride w:val="1"/>
     </w:lvlOverride>
     <w:lvlOverride w:ilvl="8">
-      <w:startOverride w:val="2"/>
+      <w:startOverride w:val="1"/>
     </w:lvlOverride>
   </w:num>
   <w:num w:numId="1009">
-    <w:abstractNumId w:val="99411"/>
-    <w:lvlOverride w:ilvl="0">
-      <w:startOverride w:val="1"/>
-    </w:lvlOverride>
-    <w:lvlOverride w:ilvl="1">
-      <w:startOverride w:val="1"/>
-    </w:lvlOverride>
-    <w:lvlOverride w:ilvl="2">
-      <w:startOverride w:val="1"/>
-    </w:lvlOverride>
-    <w:lvlOverride w:ilvl="3">
-      <w:startOverride w:val="1"/>
-    </w:lvlOverride>
-    <w:lvlOverride w:ilvl="4">
-      <w:startOverride w:val="1"/>
-    </w:lvlOverride>
-    <w:lvlOverride w:ilvl="5">
-      <w:startOverride w:val="1"/>
-    </w:lvlOverride>
-    <w:lvlOverride w:ilvl="6">
-      <w:startOverride w:val="1"/>
-    </w:lvlOverride>
-    <w:lvlOverride w:ilvl="7">
-      <w:startOverride w:val="1"/>
-    </w:lvlOverride>
-    <w:lvlOverride w:ilvl="8">
-      <w:startOverride w:val="1"/>
-    </w:lvlOverride>
-  </w:num>
-  <w:num w:numId="1010">
     <w:abstractNumId w:val="991"/>
   </w:num>
 </w:numbering>

</xml_diff>

<commit_message>
Fjern fed skrift fra brødteksten i de elleve nye vejledninger
Fremhævede ord i tekst, lister og bokse er gjort til almindelig tekst;
fede indledninger til afsnit er blevet til små mellemoverskrifter.
Kun Dato-linjen og tabellernes sumrækker er stadig fede.

Co-Authored-By: Claude Opus 5.5 <noreply@anthropic.com>
</commit_message>
<xml_diff>
--- a/Øvelser/Geografi/bjergarternes-kredsloeb/bjergarternes-kredsloeb.docx
+++ b/Øvelser/Geografi/bjergarternes-kredsloeb/bjergarternes-kredsloeb.docx
@@ -96,23 +96,7 @@
         </w:numPr>
       </w:pPr>
       <w:r>
-        <w:t xml:space="preserve">Hvad kendetegner</w:t>
-      </w:r>
-      <w:r>
-        <w:t xml:space="preserve"> </w:t>
-      </w:r>
-      <w:r>
-        <w:rPr>
-          <w:b/>
-          <w:bCs/>
-        </w:rPr>
-        <w:t xml:space="preserve">magmatiske</w:t>
-      </w:r>
-      <w:r>
-        <w:t xml:space="preserve"> </w:t>
-      </w:r>
-      <w:r>
-        <w:t xml:space="preserve">bjergarter, og hvordan dannes de? Hvad er forskellen på dybbjergarter og lavabjergarter?</w:t>
+        <w:t xml:space="preserve">Hvad kendetegner magmatiske bjergarter, og hvordan dannes de? Hvad er forskellen på dybbjergarter og lavabjergarter?</w:t>
       </w:r>
     </w:p>
     <w:p>
@@ -124,23 +108,7 @@
         </w:numPr>
       </w:pPr>
       <w:r>
-        <w:t xml:space="preserve">Hvad kendetegner</w:t>
-      </w:r>
-      <w:r>
-        <w:t xml:space="preserve"> </w:t>
-      </w:r>
-      <w:r>
-        <w:rPr>
-          <w:b/>
-          <w:bCs/>
-        </w:rPr>
-        <w:t xml:space="preserve">sedimentære</w:t>
-      </w:r>
-      <w:r>
-        <w:t xml:space="preserve"> </w:t>
-      </w:r>
-      <w:r>
-        <w:t xml:space="preserve">bjergarter, og hvordan dannes de? Nævn eksempler på klastiske, kemiske og organiske sedimentære bjergarter.</w:t>
+        <w:t xml:space="preserve">Hvad kendetegner sedimentære bjergarter, og hvordan dannes de? Nævn eksempler på klastiske, kemiske og organiske sedimentære bjergarter.</w:t>
       </w:r>
     </w:p>
     <w:p>
@@ -152,23 +120,7 @@
         </w:numPr>
       </w:pPr>
       <w:r>
-        <w:t xml:space="preserve">Hvad kendetegner</w:t>
-      </w:r>
-      <w:r>
-        <w:t xml:space="preserve"> </w:t>
-      </w:r>
-      <w:r>
-        <w:rPr>
-          <w:b/>
-          <w:bCs/>
-        </w:rPr>
-        <w:t xml:space="preserve">metamorfe</w:t>
-      </w:r>
-      <w:r>
-        <w:t xml:space="preserve"> </w:t>
-      </w:r>
-      <w:r>
-        <w:t xml:space="preserve">bjergarter, og hvordan dannes de?</w:t>
+        <w:t xml:space="preserve">Hvad kendetegner metamorfe bjergarter, og hvordan dannes de?</w:t>
       </w:r>
     </w:p>
     <w:tbl>
@@ -282,17 +234,7 @@
               </w:numPr>
             </w:pPr>
             <w:r>
-              <w:rPr>
-                <w:b/>
-                <w:bCs/>
-              </w:rPr>
-              <w:t xml:space="preserve">Kornstørrelse:</w:t>
-            </w:r>
-            <w:r>
-              <w:t xml:space="preserve"> </w:t>
-            </w:r>
-            <w:r>
-              <w:t xml:space="preserve">grovkornet (korn over ca. 5 mm), middelkornet (1–5 mm) eller finkornet (under 1 mm, kornene kan ikke skelnes med det blotte øje). Magma, der størkner langsomt dybt nede, giver store korn; lava, der størkner hurtigt, giver små korn.</w:t>
+              <w:t xml:space="preserve">Kornstørrelse: grovkornet (korn over ca. 5 mm), middelkornet (1–5 mm) eller finkornet (under 1 mm, kornene kan ikke skelnes med det blotte øje). Magma, der størkner langsomt dybt nede, giver store korn; lava, der størkner hurtigt, giver små korn.</w:t>
             </w:r>
           </w:p>
           <w:p>
@@ -304,17 +246,7 @@
               </w:numPr>
             </w:pPr>
             <w:r>
-              <w:rPr>
-                <w:b/>
-                <w:bCs/>
-              </w:rPr>
-              <w:t xml:space="preserve">Struktur:</w:t>
-            </w:r>
-            <w:r>
-              <w:t xml:space="preserve"> </w:t>
-            </w:r>
-            <w:r>
-              <w:t xml:space="preserve">ligger mineralerne hulter til bulter (typisk magmatisk), i lag (typisk sedimentær), eller er de presset ud i striber og bånd (typisk metamorf)?</w:t>
+              <w:t xml:space="preserve">Struktur: ligger mineralerne hulter til bulter (typisk magmatisk), i lag (typisk sedimentær), eller er de presset ud i striber og bånd (typisk metamorf)?</w:t>
             </w:r>
           </w:p>
           <w:p>
@@ -326,17 +258,7 @@
               </w:numPr>
             </w:pPr>
             <w:r>
-              <w:rPr>
-                <w:b/>
-                <w:bCs/>
-              </w:rPr>
-              <w:t xml:space="preserve">Hårdhed:</w:t>
-            </w:r>
-            <w:r>
-              <w:t xml:space="preserve"> </w:t>
-            </w:r>
-            <w:r>
-              <w:t xml:space="preserve">en stålkniv ridser mineraler med en hårdhed under ca. 5,5. Kvarts (hårdhed 7) og feldspat (6) kan ikke ridses af kniven; glimmer og kalkspat kan.</w:t>
+              <w:t xml:space="preserve">Hårdhed: en stålkniv ridser mineraler med en hårdhed under ca. 5,5. Kvarts (hårdhed 7) og feldspat (6) kan ikke ridses af kniven; glimmer og kalkspat kan.</w:t>
             </w:r>
           </w:p>
           <w:p>
@@ -348,17 +270,7 @@
               </w:numPr>
             </w:pPr>
             <w:r>
-              <w:rPr>
-                <w:b/>
-                <w:bCs/>
-              </w:rPr>
-              <w:t xml:space="preserve">Magnetisme:</w:t>
-            </w:r>
-            <w:r>
-              <w:t xml:space="preserve"> </w:t>
-            </w:r>
-            <w:r>
-              <w:t xml:space="preserve">en magnet, der hænger fast, afslører mineralet magnetit, som er almindeligt i mørke bjergarter som basalt og gabbro.</w:t>
+              <w:t xml:space="preserve">Magnetisme: en magnet, der hænger fast, afslører mineralet magnetit, som er almindeligt i mørke bjergarter som basalt og gabbro.</w:t>
             </w:r>
           </w:p>
           <w:p/>

</xml_diff>